<commit_message>
Engagement de confidentialité : « méthode d'évaluation de MB AxisPro Consulting » au lieu de « méthode AxisPro »
Co-Authored-By: Claude Opus 5.5 <noreply@anthropic.com>
</commit_message>
<xml_diff>
--- a/docs/projet/Engagement_de_confidentialite.docx
+++ b/docs/projet/Engagement_de_confidentialite.docx
@@ -100,7 +100,7 @@
           <w:sz w:val="23"/>
           <w:szCs w:val="23"/>
         </w:rPr>
-        <w:t xml:space="preserve">Toutes les données du Client, quel qu’en soit le support : comptabilité, banque et trésorerie, transport, contrats, clients et fournisseurs, données personnelles des salariés, des chauffeurs et des porteurs de projets, dossiers et méthode d’évaluation AxisPro, identifiants et accès.</w:t>
+        <w:t xml:space="preserve">Toutes les données du Client, quel qu’en soit le support : comptabilité, banque et trésorerie, transport, contrats, clients et fournisseurs, données personnelles des salariés, des chauffeurs et des porteurs de projets, dossiers de projets et méthode d’évaluation de MB AxisPro Consulting (grille, pondérations, étapes de validation et politique d’évaluation), identifiants et accès.</w:t>
       </w:r>
     </w:p>
     <w:p>
@@ -230,7 +230,7 @@
           <w:sz w:val="23"/>
           <w:szCs w:val="23"/>
         </w:rPr>
-        <w:t xml:space="preserve">Les copies de travail sont supprimées dans les 30 jours qui suivent la validation de la reprise, ou à la demande du Client. Les données de la plateforme restent sa propriété et lui sont remises sur demande. L’engagement vaut dès sa signature, pendant tout le projet puis cinq ans après ; sans limite de durée pour la méthode AxisPro et les secrets d’affaires du Client.</w:t>
+        <w:t xml:space="preserve">Les copies de travail sont supprimées dans les 30 jours qui suivent la validation de la reprise, ou à la demande du Client. Les données de la plateforme restent sa propriété et lui sont remises sur demande. L’engagement vaut dès sa signature, pendant tout le projet puis cinq ans après ; sans limite de durée pour cette méthode et les secrets d’affaires du Client.</w:t>
       </w:r>
     </w:p>
     <w:p>

</xml_diff>